<commit_message>
set task for 02-04-2026
</commit_message>
<xml_diff>
--- a/Daily Work Progess Updates.docx
+++ b/Daily Work Progess Updates.docx
@@ -67,14 +67,70 @@
           <w:lang w:val="en-US"/>
         </w:rPr>
         <w:br/>
-        <w:t xml:space="preserve">1]Ticket create on opan ticket create email </w:t>
-      </w:r>
-      <w:r>
-        <w:rPr>
-          <w:lang w:val="en-US"/>
-        </w:rPr>
-        <w:br/>
-        <w:t>2] implneted requerment unwanted routes issue resovle.</w:t>
+        <w:t xml:space="preserve">1]Ticket create on </w:t>
+      </w:r>
+      <w:proofErr w:type="spellStart"/>
+      <w:r>
+        <w:rPr>
+          <w:lang w:val="en-US"/>
+        </w:rPr>
+        <w:t>opan</w:t>
+      </w:r>
+      <w:proofErr w:type="spellEnd"/>
+      <w:r>
+        <w:rPr>
+          <w:lang w:val="en-US"/>
+        </w:rPr>
+        <w:t xml:space="preserve"> ticket create email </w:t>
+      </w:r>
+      <w:r>
+        <w:rPr>
+          <w:lang w:val="en-US"/>
+        </w:rPr>
+        <w:br/>
+        <w:t xml:space="preserve">2] </w:t>
+      </w:r>
+      <w:proofErr w:type="spellStart"/>
+      <w:r>
+        <w:rPr>
+          <w:lang w:val="en-US"/>
+        </w:rPr>
+        <w:t>implneted</w:t>
+      </w:r>
+      <w:proofErr w:type="spellEnd"/>
+      <w:r>
+        <w:rPr>
+          <w:lang w:val="en-US"/>
+        </w:rPr>
+        <w:t xml:space="preserve"> </w:t>
+      </w:r>
+      <w:proofErr w:type="spellStart"/>
+      <w:r>
+        <w:rPr>
+          <w:lang w:val="en-US"/>
+        </w:rPr>
+        <w:t>requerment</w:t>
+      </w:r>
+      <w:proofErr w:type="spellEnd"/>
+      <w:r>
+        <w:rPr>
+          <w:lang w:val="en-US"/>
+        </w:rPr>
+        <w:t xml:space="preserve"> unwanted routes issue </w:t>
+      </w:r>
+      <w:proofErr w:type="spellStart"/>
+      <w:r>
+        <w:rPr>
+          <w:lang w:val="en-US"/>
+        </w:rPr>
+        <w:t>resovle</w:t>
+      </w:r>
+      <w:proofErr w:type="spellEnd"/>
+      <w:r>
+        <w:rPr>
+          <w:lang w:val="en-US"/>
+        </w:rPr>
+        <w:t>.</w:t>
       </w:r>
       <w:r>
         <w:rPr>
@@ -129,8 +185,16 @@
           <w:lang w:val="en-US"/>
         </w:rPr>
         <w:br/>
-        <w:t>1] project use celery and why use to Django backend studay</w:t>
-      </w:r>
+        <w:t xml:space="preserve">1] project use celery and why use to Django backend </w:t>
+      </w:r>
+      <w:proofErr w:type="spellStart"/>
+      <w:r>
+        <w:rPr>
+          <w:lang w:val="en-US"/>
+        </w:rPr>
+        <w:t>studay</w:t>
+      </w:r>
+      <w:proofErr w:type="spellEnd"/>
       <w:r>
         <w:rPr>
           <w:lang w:val="en-US"/>
@@ -209,7 +273,21 @@
         <w:rPr>
           <w:lang w:val="en-US"/>
         </w:rPr>
-        <w:t xml:space="preserve">1]Routes rework point Issue Resovle </w:t>
+        <w:t xml:space="preserve">1]Routes rework point Issue </w:t>
+      </w:r>
+      <w:proofErr w:type="spellStart"/>
+      <w:r>
+        <w:rPr>
+          <w:lang w:val="en-US"/>
+        </w:rPr>
+        <w:t>Resovle</w:t>
+      </w:r>
+      <w:proofErr w:type="spellEnd"/>
+      <w:r>
+        <w:rPr>
+          <w:lang w:val="en-US"/>
+        </w:rPr>
+        <w:t xml:space="preserve"> </w:t>
       </w:r>
       <w:r>
         <w:rPr>
@@ -275,7 +353,21 @@
           <w:lang w:val="en-US"/>
         </w:rPr>
         <w:br/>
-        <w:t xml:space="preserve">1] Open Ticket scrolling bar Bug Resovle </w:t>
+        <w:t xml:space="preserve">1] Open Ticket scrolling bar Bug </w:t>
+      </w:r>
+      <w:proofErr w:type="spellStart"/>
+      <w:r>
+        <w:rPr>
+          <w:lang w:val="en-US"/>
+        </w:rPr>
+        <w:t>Resovle</w:t>
+      </w:r>
+      <w:proofErr w:type="spellEnd"/>
+      <w:r>
+        <w:rPr>
+          <w:lang w:val="en-US"/>
+        </w:rPr>
+        <w:t xml:space="preserve"> </w:t>
       </w:r>
       <w:r>
         <w:rPr>
@@ -339,20 +431,44 @@
         </w:rPr>
         <w:br/>
       </w:r>
-      <w:r>
-        <w:rPr>
-          <w:b/>
-          <w:lang w:val="en-US"/>
-        </w:rPr>
-        <w:t>Date :- 31-03-2026</w:t>
-      </w:r>
-      <w:r>
-        <w:rPr>
-          <w:b/>
-          <w:lang w:val="en-US"/>
-        </w:rPr>
-        <w:br/>
-        <w:t>Day :- Tuesday</w:t>
+      <w:proofErr w:type="gramStart"/>
+      <w:r>
+        <w:rPr>
+          <w:b/>
+          <w:lang w:val="en-US"/>
+        </w:rPr>
+        <w:t>Date :</w:t>
+      </w:r>
+      <w:proofErr w:type="gramEnd"/>
+      <w:r>
+        <w:rPr>
+          <w:b/>
+          <w:lang w:val="en-US"/>
+        </w:rPr>
+        <w:t>- 31-03-2026</w:t>
+      </w:r>
+      <w:r>
+        <w:rPr>
+          <w:b/>
+          <w:lang w:val="en-US"/>
+        </w:rPr>
+        <w:br/>
+      </w:r>
+      <w:proofErr w:type="gramStart"/>
+      <w:r>
+        <w:rPr>
+          <w:b/>
+          <w:lang w:val="en-US"/>
+        </w:rPr>
+        <w:t>Day :</w:t>
+      </w:r>
+      <w:proofErr w:type="gramEnd"/>
+      <w:r>
+        <w:rPr>
+          <w:b/>
+          <w:lang w:val="en-US"/>
+        </w:rPr>
+        <w:t>- Tuesday</w:t>
       </w:r>
     </w:p>
     <w:p>
@@ -427,21 +543,45 @@
           <w:lang w:val="en-US"/>
         </w:rPr>
       </w:pPr>
+      <w:proofErr w:type="gramStart"/>
       <w:r>
         <w:rPr>
           <w:b/>
           <w:lang w:val="en-US"/>
         </w:rPr>
         <w:lastRenderedPageBreak/>
-        <w:t>Date :- 01-04-2026</w:t>
-      </w:r>
-      <w:r>
-        <w:rPr>
-          <w:b/>
-          <w:lang w:val="en-US"/>
-        </w:rPr>
-        <w:br/>
-        <w:t>Day :- Tuesday</w:t>
+        <w:t>Date :</w:t>
+      </w:r>
+      <w:proofErr w:type="gramEnd"/>
+      <w:r>
+        <w:rPr>
+          <w:b/>
+          <w:lang w:val="en-US"/>
+        </w:rPr>
+        <w:t>- 01-04-2026</w:t>
+      </w:r>
+      <w:r>
+        <w:rPr>
+          <w:b/>
+          <w:lang w:val="en-US"/>
+        </w:rPr>
+        <w:br/>
+      </w:r>
+      <w:proofErr w:type="gramStart"/>
+      <w:r>
+        <w:rPr>
+          <w:b/>
+          <w:lang w:val="en-US"/>
+        </w:rPr>
+        <w:t>Day :</w:t>
+      </w:r>
+      <w:proofErr w:type="gramEnd"/>
+      <w:r>
+        <w:rPr>
+          <w:b/>
+          <w:lang w:val="en-US"/>
+        </w:rPr>
+        <w:t>- Tuesday</w:t>
       </w:r>
     </w:p>
     <w:p>
@@ -487,6 +627,141 @@
           <w:lang w:val="en-US"/>
         </w:rPr>
         <w:t>.</w:t>
+      </w:r>
+    </w:p>
+    <w:p>
+      <w:pPr>
+        <w:rPr>
+          <w:lang w:val="en-US"/>
+        </w:rPr>
+      </w:pPr>
+    </w:p>
+    <w:p>
+      <w:pPr>
+        <w:spacing w:after="0"/>
+        <w:rPr>
+          <w:b/>
+          <w:bCs/>
+          <w:lang w:val="en-US"/>
+        </w:rPr>
+      </w:pPr>
+      <w:proofErr w:type="gramStart"/>
+      <w:r>
+        <w:rPr>
+          <w:b/>
+          <w:bCs/>
+          <w:lang w:val="en-US"/>
+        </w:rPr>
+        <w:t>Date :</w:t>
+      </w:r>
+      <w:proofErr w:type="gramEnd"/>
+      <w:r>
+        <w:rPr>
+          <w:b/>
+          <w:bCs/>
+          <w:lang w:val="en-US"/>
+        </w:rPr>
+        <w:t xml:space="preserve"> 02-04-2026</w:t>
+      </w:r>
+    </w:p>
+    <w:p>
+      <w:pPr>
+        <w:spacing w:after="0"/>
+        <w:rPr>
+          <w:b/>
+          <w:bCs/>
+          <w:lang w:val="en-US"/>
+        </w:rPr>
+      </w:pPr>
+      <w:proofErr w:type="gramStart"/>
+      <w:r>
+        <w:rPr>
+          <w:b/>
+          <w:bCs/>
+          <w:lang w:val="en-US"/>
+        </w:rPr>
+        <w:t>Day :</w:t>
+      </w:r>
+      <w:proofErr w:type="gramEnd"/>
+      <w:r>
+        <w:rPr>
+          <w:b/>
+          <w:bCs/>
+          <w:lang w:val="en-US"/>
+        </w:rPr>
+        <w:t xml:space="preserve"> Wednesday</w:t>
+      </w:r>
+    </w:p>
+    <w:p>
+      <w:pPr>
+        <w:spacing w:after="0"/>
+        <w:rPr>
+          <w:lang w:val="en-US"/>
+        </w:rPr>
+      </w:pPr>
+    </w:p>
+    <w:p>
+      <w:pPr>
+        <w:rPr>
+          <w:lang w:val="en-US"/>
+        </w:rPr>
+      </w:pPr>
+      <w:r>
+        <w:rPr>
+          <w:lang w:val="en-US"/>
+        </w:rPr>
+        <w:t>1] Compete Time hours of unwanted route 1</w:t>
+      </w:r>
+      <w:r>
+        <w:rPr>
+          <w:vertAlign w:val="superscript"/>
+          <w:lang w:val="en-US"/>
+        </w:rPr>
+        <w:t>st</w:t>
+      </w:r>
+      <w:r>
+        <w:rPr>
+          <w:lang w:val="en-US"/>
+        </w:rPr>
+        <w:t xml:space="preserve"> sub-task</w:t>
+      </w:r>
+    </w:p>
+    <w:p>
+      <w:pPr>
+        <w:rPr>
+          <w:lang w:val="en-US"/>
+        </w:rPr>
+      </w:pPr>
+      <w:r>
+        <w:rPr>
+          <w:lang w:val="en-US"/>
+        </w:rPr>
+        <w:t>2] Give Time hours of analytics subtask 1</w:t>
+      </w:r>
+      <w:r>
+        <w:rPr>
+          <w:lang w:val="en-US"/>
+        </w:rPr>
+        <w:t xml:space="preserve"> </w:t>
+      </w:r>
+    </w:p>
+    <w:p>
+      <w:pPr>
+        <w:rPr>
+          <w:lang w:val="en-US"/>
+        </w:rPr>
+      </w:pPr>
+      <w:r>
+        <w:rPr>
+          <w:lang w:val="en-US"/>
+        </w:rPr>
+        <w:t xml:space="preserve">3] Complete ticket card of </w:t>
+      </w:r>
+      <w:r>
+        <w:rPr>
+          <w:lang w:val="en-US"/>
+        </w:rPr>
+        <w:t>second subtask for unwanted routes</w:t>
       </w:r>
     </w:p>
     <w:p>

</xml_diff>